<commit_message>
Revise Directors' Report reply memo with sourced CAPEX figures
Replaces the generic capital-expenditure sentence in the State of
Affairs section with the actual five-year addition trend (Rs. 9.70
lakh FY20-21 to Rs. 181.84 lakh FY25-26) and the two items behind the
FY25-26 jump — completion of the No. 3 heat-treatment furnace and a
SPECTROMAXx optical emission spectrometer — sourced directly from the
Company's asset-addition and capitalisation statements for FY2020-21,
2023-24, 2024-25 and 2025-26. Carries the same specifics into the
Technology Absorption (R&D) section's heat-treatment and quality-
testing bullets.

Co-Authored-By: Claude Sonnet 5 <noreply@anthropic.com>
Claude-Session: https://claude.ai/code/session_01KAt6XMpnq79QzphizNAsgo
</commit_message>
<xml_diff>
--- a/investor-pitch/notes/Datre_DirectorsReport_Reply_Memo_FY2025-26.docx
+++ b/investor-pitch/notes/Datre_DirectorsReport_Reply_Memo_FY2025-26.docx
@@ -31,7 +31,7 @@
           <w:sz w:val="20"/>
           <w:szCs w:val="20"/>
         </w:rPr>
-        <w:t xml:space="preserve">Memo for management and company secretary review · Datre Corporation Limited · Refers to Directors_Report_2526_Final_for_Print_1.doc</w:t>
+        <w:t xml:space="preserve">Revised draft · Memo for management and company secretary review · Datre Corporation Limited · Refers to Directors_Report_2526_Final_for_Print_1.doc</w:t>
       </w:r>
     </w:p>
     <w:p>
@@ -65,7 +65,7 @@
           <w:sz w:val="22"/>
           <w:szCs w:val="22"/>
         </w:rPr>
-        <w:t xml:space="preserve">Three sections of the circulated draft were highlighted: the State of Affairs and Future Outlook paragraphs, the Technology Absorption (R&amp;D) disclosure, and the Management Discussion and Analysis. All three read as carried-forward boilerplate rather than this year's actual results. Proposed replacement text for each is below, drafted from the same financial and operational facts used in the Note 24 going-concern redraft, so the Directors' Report, Note 24 and the audited figures all tell the same story. Bracketed text highlighted in yellow marks figures to be confirmed by the finance team. One likely typo is flagged separately.</w:t>
+        <w:t xml:space="preserve">Three sections of the circulated draft were highlighted: the State of Affairs and Future Outlook paragraphs, the Technology Absorption (R&amp;D) disclosure, and the Management Discussion and Analysis. All three read as carried-forward boilerplate rather than this year's actual results. Proposed replacement text for each is below, drafted from the same financial and operational facts used in the Note 24 going-concern redraft, so the Directors' Report, Note 24 and the audited figures all tell the same story. This revision replaces the generic capital-expenditure sentence with the actual five-year addition figures and the two capital items behind the FY 2025-26 jump, sourced directly from the Company's asset-addition and capitalisation statements for FY 2020-21, 2023-24, 2024-25 and 2025-26, and carries the same specifics into the R&amp;D disclosure. Bracketed text highlighted in yellow marks figures to be confirmed by the finance team. One likely typo is flagged separately.</w:t>
       </w:r>
     </w:p>
     <w:p>
@@ -208,7 +208,22 @@
           <w:sz w:val="22"/>
           <w:szCs w:val="22"/>
         </w:rPr>
-        <w:t xml:space="preserve">The Company continued its capital expenditure programme to upgrade machinery and heat-treatment infrastructure and to revamp existing plant to reduce breakdowns. Based on this progress, your directors remain confident that operations will continue to improve in the year ahead, while noting that the Komatsu, Thejo/Brazil and Tega/Sweden developments remain at trial or negotiation stage and are not yet reflected in confirmed order volumes.</w:t>
+        <w:t xml:space="preserve">The Company's capital expenditure has grown sharply over the past five years — from Rs. 9.70 lakh in FY 2020-21 to Rs. 23.72 lakh in FY 2023-24, Rs. 51.85 lakh in FY 2024-25 and Rs. 181.84 lakh in FY 2025-26. The FY 2025-26 spend was concentrated in two areas: completion of the No. 3 heat-treatment furnace (Rs. 80.68 lakh, including Rs. 22.75 lakh carried forward as work-in-progress from the previous year) and acquisition of a SPECTROMAXx optical emission spectrometer (Rs. 36.18 lakh) to strengthen in-house metallurgical testing capability. This follows the revamping of the No. 1 heat-treatment furnace and the water-quenching tank undertaken in FY 2024-25, and continues the Company's programme of selectively upgrading and refurbishing existing plant rather than replacing it wholesale.</w:t>
+      </w:r>
+    </w:p>
+    <w:p>
+      <w:pPr>
+        <w:spacing w:after="180" w:line="300"/>
+        <w:jc w:val="both"/>
+      </w:pPr>
+      <w:r>
+        <w:rPr>
+          <w:rFonts w:ascii="Calibri" w:cs="Calibri" w:eastAsia="Calibri" w:hAnsi="Calibri"/>
+          <w:color w:val="1A1A1A"/>
+          <w:sz w:val="22"/>
+          <w:szCs w:val="22"/>
+        </w:rPr>
+        <w:t xml:space="preserve">Based on this progress, your directors remain confident that operations will continue to improve in the year ahead, while noting that the Komatsu, Thejo/Brazil and Tega/Sweden developments remain at trial or negotiation stage and are not yet reflected in confirmed order volumes.</w:t>
       </w:r>
     </w:p>
     <w:p>
@@ -320,7 +335,27 @@
           <w:sz w:val="22"/>
           <w:szCs w:val="22"/>
         </w:rPr>
-        <w:t xml:space="preserve">Development of specialised heat-treatment cycles and quenching parameters for new high-chrome and CrMo-grade castings.</w:t>
+        <w:t xml:space="preserve">Development of specialised heat-treatment cycles and quenching parameters for new high-chrome and CrMo-grade castings, supported by completion of the No. 3 heat-treatment furnace and revamping of the No. 1 furnace and water-quenching tank during the year.</w:t>
+      </w:r>
+    </w:p>
+    <w:p>
+      <w:pPr>
+        <w:pStyle w:val="ListParagraph"/>
+        <w:numPr>
+          <w:ilvl w:val="0"/>
+          <w:numId w:val="1"/>
+        </w:numPr>
+        <w:spacing w:after="100" w:line="280"/>
+        <w:ind w:left="360"/>
+      </w:pPr>
+      <w:r>
+        <w:rPr>
+          <w:rFonts w:ascii="Calibri" w:cs="Calibri" w:eastAsia="Calibri" w:hAnsi="Calibri"/>
+          <w:color w:val="1A1A1A"/>
+          <w:sz w:val="22"/>
+          <w:szCs w:val="22"/>
+        </w:rPr>
+        <w:t xml:space="preserve">Acquisition of a SPECTROMAXx optical emission spectrometer to strengthen in-house metallurgical testing and quality-control capability.</w:t>
       </w:r>
     </w:p>
     <w:p>
@@ -457,6 +492,26 @@
           <w:szCs w:val="22"/>
         </w:rPr>
         <w:t xml:space="preserve">Field validation of new mill-liner castings, including a successful trial run in Sweden.</w:t>
+      </w:r>
+    </w:p>
+    <w:p>
+      <w:pPr>
+        <w:pStyle w:val="ListParagraph"/>
+        <w:numPr>
+          <w:ilvl w:val="0"/>
+          <w:numId w:val="1"/>
+        </w:numPr>
+        <w:spacing w:after="100" w:line="280"/>
+        <w:ind w:left="360"/>
+      </w:pPr>
+      <w:r>
+        <w:rPr>
+          <w:rFonts w:ascii="Calibri" w:cs="Calibri" w:eastAsia="Calibri" w:hAnsi="Calibri"/>
+          <w:color w:val="1A1A1A"/>
+          <w:sz w:val="22"/>
+          <w:szCs w:val="22"/>
+        </w:rPr>
+        <w:t xml:space="preserve">Strengthened in-house metallurgical testing capability, supporting quality assurance for safety-critical and export-qualified castings.</w:t>
       </w:r>
     </w:p>
     <w:p>

</xml_diff>